<commit_message>
Forensic revision v3.1.0 for TS-01/TS-03/TS-05/TS-07 via object-store pipeline (worktree writes were being discarded): outbox SQL columns, classification-board probe, ulms_db fix, HikariCP pool reconciliation + LaTeX repair, ulms schema prefix, HMAC-before-200 webhook step, loan row-lock semantics; addenda + revision rows; md twins synced
</commit_message>
<xml_diff>
--- a/technical_document/docx/02_troubleshooting/DOC-02-TS-03_PostgreSQL_Connection_Pool_and_Lock_Contention_Diagnostics.docx
+++ b/technical_document/docx/02_troubleshooting/DOC-02-TS-03_PostgreSQL_Connection_Pool_and_Lock_Contention_Diagnostics.docx
@@ -2578,13 +2578,13 @@
         </w:rPr>
         <w:t>$$</w:t>
         <w:tab/>
-        <w:t>\t\t\t\t\t\text{MaximumPoolSize} = (</w:t>
+        <w:t>\t\t\t\t\t\t\t\text{MaximumPoolSize} = (</w:t>
         <w:tab/>
         <w:t xml:space="preserve">ext{CPU\_Cores} </w:t>
         <w:tab/>
         <w:t xml:space="preserve">imes 2) + </w:t>
         <w:tab/>
-        <w:t>\t\t\t\t\t\text{Effective\_Spindle\_Count}$$</w:t>
+        <w:t>\t\t\t\t\t\t\t\text{Effective\_Spindle\_Count}$$</w:t>
       </w:r>
     </w:p>
     <w:p>

</xml_diff>